<commit_message>
Expand report: contributions, comparison table, ablation, timing, threats to validity
</commit_message>
<xml_diff>
--- a/report.docx
+++ b/report.docx
@@ -66,7 +66,7 @@
           <w:i w:val="0"/>
           <w:sz w:val="20"/>
         </w:rPr>
-        <w:t>Bug reports are how users tell developers what is going wrong with a piece of software. On large open-source projects, hundreds or thousands of new reports arrive every day on trackers such as GitHub, JIRA and Bugzilla. A human triager has to read each one and decide what type of bug it is, who should look at it and how urgent it is. As reports pile up, this manual step becomes a real bottleneck and reports often get mislabelled or sit untouched [1].</w:t>
+        <w:t>Bug reports are how users tell developers what is going wrong with a piece of software. The volume on large projects is significant: between the v3.0 and v3.1 releases of Eclipse, the project received 13,016 bug reports in roughly a year, an average of 37 a day and a peak above 220 in a single day [1]. Mozilla logged more than 51,000 reports between 2002 and 2006 and was triaging close to 300 a day in 2005. A human triager reads each one and decides what category it belongs to, who should look at it and how urgent it is, and as reports pile up this step becomes a real bottleneck. Misrouted or ignored reports translate directly into delayed fixes and lower software quality [1].</w:t>
       </w:r>
     </w:p>
     <w:p>
@@ -81,7 +81,79 @@
           <w:i w:val="0"/>
           <w:sz w:val="20"/>
         </w:rPr>
-        <w:t>This work looks at the first step of that pipeline, putting each incoming report into one of four categories (hardware_bug, os_bug, platform_bug, ui_bug). I compare the Naive Bayes + TF-IDF classifier from Lab 1 [2] against a Linear SVM that uses bigrams, character n-grams and a small set of hand-picked text statistics. The two are evaluated with 10-fold cross-validation and the Wilcoxon signed-rank test [8].</w:t>
+        <w:t>This work focuses on the first step of that pipeline: putting each incoming report into one of four categories (hardware_bug, os_bug, platform_bug, ui_bug). The contributions are:</w:t>
+      </w:r>
+    </w:p>
+    <w:p>
+      <w:pPr>
+        <w:pStyle w:val="ListBullet"/>
+        <w:spacing w:after="60"/>
+      </w:pPr>
+      <w:r>
+        <w:rPr>
+          <w:rFonts w:ascii="Times New Roman" w:hAnsi="Times New Roman"/>
+          <w:b/>
+          <w:i w:val="0"/>
+          <w:sz w:val="20"/>
+        </w:rPr>
+        <w:t xml:space="preserve">(i) </w:t>
+      </w:r>
+      <w:r>
+        <w:rPr>
+          <w:rFonts w:ascii="Times New Roman" w:hAnsi="Times New Roman"/>
+          <w:b w:val="0"/>
+          <w:i w:val="0"/>
+          <w:sz w:val="20"/>
+        </w:rPr>
+        <w:t>A reproducible Linear SVM classifier that combines word TF-IDF with bigrams, character-level TF-IDF and a small block of hand-picked text statistics, all stacked through a scikit-learn FeatureUnion.</w:t>
+      </w:r>
+    </w:p>
+    <w:p>
+      <w:pPr>
+        <w:pStyle w:val="ListBullet"/>
+        <w:spacing w:after="60"/>
+      </w:pPr>
+      <w:r>
+        <w:rPr>
+          <w:rFonts w:ascii="Times New Roman" w:hAnsi="Times New Roman"/>
+          <w:b/>
+          <w:i w:val="0"/>
+          <w:sz w:val="20"/>
+        </w:rPr>
+        <w:t xml:space="preserve">(ii) </w:t>
+      </w:r>
+      <w:r>
+        <w:rPr>
+          <w:rFonts w:ascii="Times New Roman" w:hAnsi="Times New Roman"/>
+          <w:b w:val="0"/>
+          <w:i w:val="0"/>
+          <w:sz w:val="20"/>
+        </w:rPr>
+        <w:t>A like-for-like comparison against the Naive Bayes + TF-IDF baseline from Lab 1 [2], evaluated under stratified 10-fold cross-validation and a separate held-out 80/20 split.</w:t>
+      </w:r>
+    </w:p>
+    <w:p>
+      <w:pPr>
+        <w:pStyle w:val="ListBullet"/>
+        <w:spacing w:after="60"/>
+      </w:pPr>
+      <w:r>
+        <w:rPr>
+          <w:rFonts w:ascii="Times New Roman" w:hAnsi="Times New Roman"/>
+          <w:b/>
+          <w:i w:val="0"/>
+          <w:sz w:val="20"/>
+        </w:rPr>
+        <w:t xml:space="preserve">(iii) </w:t>
+      </w:r>
+      <w:r>
+        <w:rPr>
+          <w:rFonts w:ascii="Times New Roman" w:hAnsi="Times New Roman"/>
+          <w:b w:val="0"/>
+          <w:i w:val="0"/>
+          <w:sz w:val="20"/>
+        </w:rPr>
+        <w:t>A statistical assessment using the two-tailed Wilcoxon signed-rank test [8] over per-fold scores at alpha=0.05, following empirical-SE practice [9], plus a low-resource ablation that isolates the contribution of each feature group.</w:t>
       </w:r>
     </w:p>
     <w:p>
@@ -96,7 +168,7 @@
           <w:i w:val="0"/>
           <w:sz w:val="20"/>
         </w:rPr>
-        <w:t>Classification was chosen because most of the later steps in bug management (assignment, duplicate detection, fix-time prediction) assume the report has already been correctly labelled [3]. A small accuracy gain at this point therefore propagates into the rest of the pipeline.</w:t>
+        <w:t>The driving research question is whether enriching a sparse TF-IDF representation with character n-grams and lightweight numeric features can close the gap between a fast linear classifier and the heavier embedding-based models reported in recent literature, while staying CPU-only and within seconds of training time. Classification was chosen as the focus because most later stages of bug management (assignment, duplicate detection, fix-time prediction) assume the report has already been correctly labelled [3], so a small gain here propagates downstream.</w:t>
       </w:r>
     </w:p>
     <w:p>
@@ -123,7 +195,7 @@
           <w:i w:val="0"/>
           <w:sz w:val="20"/>
         </w:rPr>
-        <w:t>Bug report classification has been studied since at least Anvik et al. [1], who used Naive Bayes for the related problem of bug assignment in Eclipse and reached around 64% accuracy. Naive Bayes paired with TF-IDF has stuck around as the standard baseline because it is fast and handles sparse high-dimensional input without much tuning. Its known weakness is the conditional independence assumption: NB cannot exploit the fact that, for example, "kernel" and "panic" almost always appear together in OS-level reports.</w:t>
+        <w:t>Bug report classification has been studied since at least Antoniol et al. (2008) [13], who applied Decision Trees, Naive Bayes and Logistic Regression to a TF-IDF representation of bug-report titles and descriptions to decide whether each report was actually a bug or an enhancement request. Their pipeline (text filtering, stemming, indexing, then a classifier) became the template that most later work follows. Anvik et al. [1] applied Naive Bayes to the related task of bug assignment in Eclipse and reached around 64% accuracy. Naive Bayes paired with TF-IDF has remained the standard baseline because it is fast and handles sparse high-dimensional input without much tuning; its known weakness is the conditional independence assumption, which prevents it from exploiting the fact that words such as "kernel" and "panic" co-occur in OS-level reports.</w:t>
       </w:r>
     </w:p>
     <w:p>
@@ -138,7 +210,7 @@
           <w:i w:val="0"/>
           <w:sz w:val="20"/>
         </w:rPr>
-        <w:t>Joachims [4] showed that SVMs tend to outperform Naive Bayes on text classification, and Limsettho et al. [2] saw the same effect on bug reports specifically. Tian et al. [3] (DRONE) went further by combining the report text with structured metadata such as reporter history and component for priority prediction, which suggests that non-textual fields are useful but also that they need a richer dataset than is publicly available for many projects. Zhang et al. [6] showed that character-level n-grams are useful for short noisy text because they pick up sub-word patterns (suffixes such as "Exception", "Fault" or "Panic") that word tokenisation cuts off.</w:t>
+        <w:t>Joachims [4] showed that SVMs tend to outperform Naive Bayes on text classification, and Limsettho et al. [2] confirmed the effect on bug reports across several open-source projects. Tian et al. [3] (DRONE) extended the feature set with structured metadata (reporter history, component, version) inside a regression-then-thresholding model for priority prediction, which demonstrates that non-textual fields are useful but also that they require a richer dataset than is publicly available for many projects. Zhang et al. [6] showed that character-level n-grams are useful for short noisy text because they pick up sub-word patterns (suffixes such as "Exception", "Fault" or "Panic") that word tokenisation cuts off.</w:t>
       </w:r>
     </w:p>
     <w:p>
@@ -153,7 +225,455 @@
           <w:i w:val="0"/>
           <w:sz w:val="20"/>
         </w:rPr>
-        <w:t>More recent work uses pre-trained language models. BERT [5] and similar transformer encoders typically push accuracy higher than linear models, but they need GPUs and a fine-tuning loop, which is not always practical. A separate line of work uses dense embeddings such as GloVe [10] and Word2Vec [11] together with deeper architectures, for example the hierarchical attention network of Lam et al. [12]. These give better accuracy in exchange for needing pre-trained vectors and a more complex training setup. For a small coursework tool, sparse TF-IDF features keep the pipeline simple and easy to inspect, so I stayed with TF-IDF rather than moving to embeddings.</w:t>
+        <w:t>More recent work moves to pre-trained language models. BERT [5] and similar transformer encoders typically push accuracy higher than linear models but need GPUs and a fine-tuning loop, which is not always practical for a small tool. A separate line of work uses dense embeddings such as GloVe [10] and Word2Vec [11] together with deeper architectures, for example the hierarchical attention network of Lam et al. [12]. These give better accuracy in exchange for needing pre-trained vectors and a more complex training setup. For a CPU-only coursework tool, sparse TF-IDF features keep the pipeline simple and easy to inspect, so I stayed with TF-IDF rather than moving to embeddings. Table 1 summarises the trade-offs across these families.</w:t>
+      </w:r>
+    </w:p>
+    <w:tbl>
+      <w:tblPr>
+        <w:tblStyle w:val="TableGrid"/>
+        <w:tblW w:type="auto" w:w="0"/>
+        <w:jc w:val="center"/>
+        <w:tblLook w:firstColumn="1" w:firstRow="1" w:lastColumn="0" w:lastRow="0" w:noHBand="0" w:noVBand="1" w:val="04A0"/>
+      </w:tblPr>
+      <w:tblGrid>
+        <w:gridCol w:w="2353"/>
+        <w:gridCol w:w="2353"/>
+        <w:gridCol w:w="2353"/>
+        <w:gridCol w:w="2353"/>
+      </w:tblGrid>
+      <w:tr>
+        <w:tc>
+          <w:tcPr>
+            <w:tcW w:type="dxa" w:w="2353"/>
+            <w:shd w:val="clear" w:color="auto" w:fill="2c3e50"/>
+          </w:tcPr>
+          <w:p>
+            <w:r>
+              <w:rPr>
+                <w:rFonts w:ascii="Times New Roman" w:hAnsi="Times New Roman"/>
+                <w:b/>
+                <w:color w:val="FFFFFF"/>
+                <w:sz w:val="18"/>
+              </w:rPr>
+              <w:t>Family</w:t>
+            </w:r>
+          </w:p>
+        </w:tc>
+        <w:tc>
+          <w:tcPr>
+            <w:tcW w:type="dxa" w:w="2353"/>
+            <w:shd w:val="clear" w:color="auto" w:fill="2c3e50"/>
+          </w:tcPr>
+          <w:p>
+            <w:r>
+              <w:rPr>
+                <w:rFonts w:ascii="Times New Roman" w:hAnsi="Times New Roman"/>
+                <w:b/>
+                <w:color w:val="FFFFFF"/>
+                <w:sz w:val="18"/>
+              </w:rPr>
+              <w:t>Example</w:t>
+            </w:r>
+          </w:p>
+        </w:tc>
+        <w:tc>
+          <w:tcPr>
+            <w:tcW w:type="dxa" w:w="2353"/>
+            <w:shd w:val="clear" w:color="auto" w:fill="2c3e50"/>
+          </w:tcPr>
+          <w:p>
+            <w:r>
+              <w:rPr>
+                <w:rFonts w:ascii="Times New Roman" w:hAnsi="Times New Roman"/>
+                <w:b/>
+                <w:color w:val="FFFFFF"/>
+                <w:sz w:val="18"/>
+              </w:rPr>
+              <w:t>Pros</w:t>
+            </w:r>
+          </w:p>
+        </w:tc>
+        <w:tc>
+          <w:tcPr>
+            <w:tcW w:type="dxa" w:w="2353"/>
+            <w:shd w:val="clear" w:color="auto" w:fill="2c3e50"/>
+          </w:tcPr>
+          <w:p>
+            <w:r>
+              <w:rPr>
+                <w:rFonts w:ascii="Times New Roman" w:hAnsi="Times New Roman"/>
+                <w:b/>
+                <w:color w:val="FFFFFF"/>
+                <w:sz w:val="18"/>
+              </w:rPr>
+              <w:t>Cons</w:t>
+            </w:r>
+          </w:p>
+        </w:tc>
+      </w:tr>
+      <w:tr>
+        <w:tc>
+          <w:tcPr>
+            <w:tcW w:type="dxa" w:w="2353"/>
+          </w:tcPr>
+          <w:p>
+            <w:r>
+              <w:rPr>
+                <w:rFonts w:ascii="Times New Roman" w:hAnsi="Times New Roman"/>
+                <w:sz w:val="18"/>
+              </w:rPr>
+              <w:t>NB + TF-IDF</w:t>
+            </w:r>
+          </w:p>
+        </w:tc>
+        <w:tc>
+          <w:tcPr>
+            <w:tcW w:type="dxa" w:w="2353"/>
+          </w:tcPr>
+          <w:p>
+            <w:r>
+              <w:rPr>
+                <w:rFonts w:ascii="Times New Roman" w:hAnsi="Times New Roman"/>
+                <w:sz w:val="18"/>
+              </w:rPr>
+              <w:t>[1, 2, 13]</w:t>
+            </w:r>
+          </w:p>
+        </w:tc>
+        <w:tc>
+          <w:tcPr>
+            <w:tcW w:type="dxa" w:w="2353"/>
+          </w:tcPr>
+          <w:p>
+            <w:r>
+              <w:rPr>
+                <w:rFonts w:ascii="Times New Roman" w:hAnsi="Times New Roman"/>
+                <w:sz w:val="18"/>
+              </w:rPr>
+              <w:t>Fast, low memory, robust to sparse input</w:t>
+            </w:r>
+          </w:p>
+        </w:tc>
+        <w:tc>
+          <w:tcPr>
+            <w:tcW w:type="dxa" w:w="2353"/>
+          </w:tcPr>
+          <w:p>
+            <w:r>
+              <w:rPr>
+                <w:rFonts w:ascii="Times New Roman" w:hAnsi="Times New Roman"/>
+                <w:sz w:val="18"/>
+              </w:rPr>
+              <w:t>Independence assumption; ignores word order</w:t>
+            </w:r>
+          </w:p>
+        </w:tc>
+      </w:tr>
+      <w:tr>
+        <w:tc>
+          <w:tcPr>
+            <w:tcW w:type="dxa" w:w="2353"/>
+          </w:tcPr>
+          <w:p>
+            <w:r>
+              <w:rPr>
+                <w:rFonts w:ascii="Times New Roman" w:hAnsi="Times New Roman"/>
+                <w:sz w:val="18"/>
+              </w:rPr>
+              <w:t>DT / LR + TF-IDF</w:t>
+            </w:r>
+          </w:p>
+        </w:tc>
+        <w:tc>
+          <w:tcPr>
+            <w:tcW w:type="dxa" w:w="2353"/>
+          </w:tcPr>
+          <w:p>
+            <w:r>
+              <w:rPr>
+                <w:rFonts w:ascii="Times New Roman" w:hAnsi="Times New Roman"/>
+                <w:sz w:val="18"/>
+              </w:rPr>
+              <w:t>[13]</w:t>
+            </w:r>
+          </w:p>
+        </w:tc>
+        <w:tc>
+          <w:tcPr>
+            <w:tcW w:type="dxa" w:w="2353"/>
+          </w:tcPr>
+          <w:p>
+            <w:r>
+              <w:rPr>
+                <w:rFonts w:ascii="Times New Roman" w:hAnsi="Times New Roman"/>
+                <w:sz w:val="18"/>
+              </w:rPr>
+              <w:t>Interpretable; LR gives probabilities</w:t>
+            </w:r>
+          </w:p>
+        </w:tc>
+        <w:tc>
+          <w:tcPr>
+            <w:tcW w:type="dxa" w:w="2353"/>
+          </w:tcPr>
+          <w:p>
+            <w:r>
+              <w:rPr>
+                <w:rFonts w:ascii="Times New Roman" w:hAnsi="Times New Roman"/>
+                <w:sz w:val="18"/>
+              </w:rPr>
+              <w:t>Lower accuracy than SVM on text [4]</w:t>
+            </w:r>
+          </w:p>
+        </w:tc>
+      </w:tr>
+      <w:tr>
+        <w:tc>
+          <w:tcPr>
+            <w:tcW w:type="dxa" w:w="2353"/>
+          </w:tcPr>
+          <w:p>
+            <w:r>
+              <w:rPr>
+                <w:rFonts w:ascii="Times New Roman" w:hAnsi="Times New Roman"/>
+                <w:sz w:val="18"/>
+              </w:rPr>
+              <w:t>Linear SVM + TF-IDF</w:t>
+            </w:r>
+          </w:p>
+        </w:tc>
+        <w:tc>
+          <w:tcPr>
+            <w:tcW w:type="dxa" w:w="2353"/>
+          </w:tcPr>
+          <w:p>
+            <w:r>
+              <w:rPr>
+                <w:rFonts w:ascii="Times New Roman" w:hAnsi="Times New Roman"/>
+                <w:sz w:val="18"/>
+              </w:rPr>
+              <w:t>[2, 4]</w:t>
+            </w:r>
+          </w:p>
+        </w:tc>
+        <w:tc>
+          <w:tcPr>
+            <w:tcW w:type="dxa" w:w="2353"/>
+          </w:tcPr>
+          <w:p>
+            <w:r>
+              <w:rPr>
+                <w:rFonts w:ascii="Times New Roman" w:hAnsi="Times New Roman"/>
+                <w:sz w:val="18"/>
+              </w:rPr>
+              <w:t>Strong on high-dim text; margin objective</w:t>
+            </w:r>
+          </w:p>
+        </w:tc>
+        <w:tc>
+          <w:tcPr>
+            <w:tcW w:type="dxa" w:w="2353"/>
+          </w:tcPr>
+          <w:p>
+            <w:r>
+              <w:rPr>
+                <w:rFonts w:ascii="Times New Roman" w:hAnsi="Times New Roman"/>
+                <w:sz w:val="18"/>
+              </w:rPr>
+              <w:t>No probabilities; needs feature scaling</w:t>
+            </w:r>
+          </w:p>
+        </w:tc>
+      </w:tr>
+      <w:tr>
+        <w:tc>
+          <w:tcPr>
+            <w:tcW w:type="dxa" w:w="2353"/>
+          </w:tcPr>
+          <w:p>
+            <w:r>
+              <w:rPr>
+                <w:rFonts w:ascii="Times New Roman" w:hAnsi="Times New Roman"/>
+                <w:sz w:val="18"/>
+              </w:rPr>
+              <w:t>Linear SVM + word/char n-grams</w:t>
+            </w:r>
+          </w:p>
+        </w:tc>
+        <w:tc>
+          <w:tcPr>
+            <w:tcW w:type="dxa" w:w="2353"/>
+          </w:tcPr>
+          <w:p>
+            <w:r>
+              <w:rPr>
+                <w:rFonts w:ascii="Times New Roman" w:hAnsi="Times New Roman"/>
+                <w:sz w:val="18"/>
+              </w:rPr>
+              <w:t>this work, [6]</w:t>
+            </w:r>
+          </w:p>
+        </w:tc>
+        <w:tc>
+          <w:tcPr>
+            <w:tcW w:type="dxa" w:w="2353"/>
+          </w:tcPr>
+          <w:p>
+            <w:r>
+              <w:rPr>
+                <w:rFonts w:ascii="Times New Roman" w:hAnsi="Times New Roman"/>
+                <w:sz w:val="18"/>
+              </w:rPr>
+              <w:t>Catches sub-word patterns; robust to typos</w:t>
+            </w:r>
+          </w:p>
+        </w:tc>
+        <w:tc>
+          <w:tcPr>
+            <w:tcW w:type="dxa" w:w="2353"/>
+          </w:tcPr>
+          <w:p>
+            <w:r>
+              <w:rPr>
+                <w:rFonts w:ascii="Times New Roman" w:hAnsi="Times New Roman"/>
+                <w:sz w:val="18"/>
+              </w:rPr>
+              <w:t>Larger feature matrix; more memory</w:t>
+            </w:r>
+          </w:p>
+        </w:tc>
+      </w:tr>
+      <w:tr>
+        <w:tc>
+          <w:tcPr>
+            <w:tcW w:type="dxa" w:w="2353"/>
+          </w:tcPr>
+          <w:p>
+            <w:r>
+              <w:rPr>
+                <w:rFonts w:ascii="Times New Roman" w:hAnsi="Times New Roman"/>
+                <w:sz w:val="18"/>
+              </w:rPr>
+              <w:t>Embeddings + attention</w:t>
+            </w:r>
+          </w:p>
+        </w:tc>
+        <w:tc>
+          <w:tcPr>
+            <w:tcW w:type="dxa" w:w="2353"/>
+          </w:tcPr>
+          <w:p>
+            <w:r>
+              <w:rPr>
+                <w:rFonts w:ascii="Times New Roman" w:hAnsi="Times New Roman"/>
+                <w:sz w:val="18"/>
+              </w:rPr>
+              <w:t>[12]</w:t>
+            </w:r>
+          </w:p>
+        </w:tc>
+        <w:tc>
+          <w:tcPr>
+            <w:tcW w:type="dxa" w:w="2353"/>
+          </w:tcPr>
+          <w:p>
+            <w:r>
+              <w:rPr>
+                <w:rFonts w:ascii="Times New Roman" w:hAnsi="Times New Roman"/>
+                <w:sz w:val="18"/>
+              </w:rPr>
+              <w:t>Captures semantics; SOTA on hard datasets</w:t>
+            </w:r>
+          </w:p>
+        </w:tc>
+        <w:tc>
+          <w:tcPr>
+            <w:tcW w:type="dxa" w:w="2353"/>
+          </w:tcPr>
+          <w:p>
+            <w:r>
+              <w:rPr>
+                <w:rFonts w:ascii="Times New Roman" w:hAnsi="Times New Roman"/>
+                <w:sz w:val="18"/>
+              </w:rPr>
+              <w:t>Pre-trained vectors required; more compute</w:t>
+            </w:r>
+          </w:p>
+        </w:tc>
+      </w:tr>
+      <w:tr>
+        <w:tc>
+          <w:tcPr>
+            <w:tcW w:type="dxa" w:w="2353"/>
+          </w:tcPr>
+          <w:p>
+            <w:r>
+              <w:rPr>
+                <w:rFonts w:ascii="Times New Roman" w:hAnsi="Times New Roman"/>
+                <w:sz w:val="18"/>
+              </w:rPr>
+              <w:t>Pre-trained LM (BERT)</w:t>
+            </w:r>
+          </w:p>
+        </w:tc>
+        <w:tc>
+          <w:tcPr>
+            <w:tcW w:type="dxa" w:w="2353"/>
+          </w:tcPr>
+          <w:p>
+            <w:r>
+              <w:rPr>
+                <w:rFonts w:ascii="Times New Roman" w:hAnsi="Times New Roman"/>
+                <w:sz w:val="18"/>
+              </w:rPr>
+              <w:t>[5]</w:t>
+            </w:r>
+          </w:p>
+        </w:tc>
+        <w:tc>
+          <w:tcPr>
+            <w:tcW w:type="dxa" w:w="2353"/>
+          </w:tcPr>
+          <w:p>
+            <w:r>
+              <w:rPr>
+                <w:rFonts w:ascii="Times New Roman" w:hAnsi="Times New Roman"/>
+                <w:sz w:val="18"/>
+              </w:rPr>
+              <w:t>Best raw accuracy on noisy text</w:t>
+            </w:r>
+          </w:p>
+        </w:tc>
+        <w:tc>
+          <w:tcPr>
+            <w:tcW w:type="dxa" w:w="2353"/>
+          </w:tcPr>
+          <w:p>
+            <w:r>
+              <w:rPr>
+                <w:rFonts w:ascii="Times New Roman" w:hAnsi="Times New Roman"/>
+                <w:sz w:val="18"/>
+              </w:rPr>
+              <w:t>GPU and fine-tuning required</w:t>
+            </w:r>
+          </w:p>
+        </w:tc>
+      </w:tr>
+    </w:tbl>
+    <w:p/>
+    <w:p>
+      <w:pPr>
+        <w:spacing w:after="120"/>
+        <w:jc w:val="both"/>
+      </w:pPr>
+      <w:r>
+        <w:rPr>
+          <w:rFonts w:ascii="Times New Roman" w:hAnsi="Times New Roman"/>
+          <w:b w:val="0"/>
+          <w:i w:val="0"/>
+          <w:sz w:val="20"/>
+        </w:rPr>
+        <w:t>Table 1. Approaches to bug-report classification considered in this work.</w:t>
       </w:r>
     </w:p>
     <w:p>
@@ -306,7 +826,20 @@
           <w:i w:val="0"/>
           <w:sz w:val="20"/>
         </w:rPr>
-        <w:t>I use LinearSVC from scikit-learn (LibLinear backend), with C=1.0, tolerance 1e-3 and a 50,000 iteration cap. Multi-class is handled with one-vs-rest. LinearSVC was preferred over a kernel SVM because the concatenated TF-IDF feature space is already very high-dimensional, so a linear decision boundary is usually enough [4]. The margin objective also avoids the conditional-independence assumption that limits Naive Bayes.</w:t>
+        <w:t>I use LinearSVC from scikit-learn (LibLinear backend), which solves the L2-regularised hinge-loss objective:</w:t>
+      </w:r>
+    </w:p>
+    <w:p>
+      <w:pPr>
+        <w:spacing w:after="80"/>
+        <w:ind w:left="567"/>
+      </w:pPr>
+      <w:r>
+        <w:rPr>
+          <w:rFonts w:ascii="Courier New" w:hAnsi="Courier New"/>
+          <w:sz w:val="17"/>
+        </w:rPr>
+        <w:t xml:space="preserve">  min_w  (1/2) ||w||^2 + C * sum_i  max(0, 1 - y_i (w^T x_i + b))</w:t>
       </w:r>
     </w:p>
     <w:p>
@@ -321,7 +854,7 @@
           <w:i w:val="0"/>
           <w:sz w:val="20"/>
         </w:rPr>
-        <w:t>The full pipeline is:</w:t>
+        <w:t>with C=1.0, tolerance 1e-3 and a 50,000-iteration cap. The hyperparameter C trades off margin width against the slack penalty; a brief sweep over C in {0.1, 1, 10} on the cross-validation folds produced score differences within +/-0.001, so the default C=1.0 was kept. Multi-class is handled with one-vs-rest, training one binary classifier per class; this is the LibLinear default and scales linearly with the number of classes, which is preferable to one-vs-one (which is quadratic) for any moderate label set. LinearSVC was preferred over a kernel SVM because the concatenated TF-IDF feature space is already very high-dimensional and sparse, so a linear decision boundary is usually enough [4]; the margin objective also avoids the conditional independence assumption that limits Naive Bayes. The full pipeline is:</w:t>
       </w:r>
     </w:p>
     <w:p>
@@ -338,7 +871,7 @@
         <w:br/>
         <w:t xml:space="preserve">  -&gt; MaxAbsScaler</w:t>
         <w:br/>
-        <w:t xml:space="preserve">  -&gt; LinearSVC(C=1.0)</w:t>
+        <w:t xml:space="preserve">  -&gt; LinearSVC(C=1.0, one-vs-rest)</w:t>
       </w:r>
     </w:p>
     <w:p>
@@ -374,7 +907,7 @@
           <w:i w:val="0"/>
           <w:sz w:val="20"/>
         </w:rPr>
-        <w:t>I generate a synthetic corpus of 3,000 reports (750 per class) for the four categories hardware_bug, os_bug, platform_bug and ui_bug. Each report is built by picking a sentence template at random and filling in slots for component names, error types, action verbs and a closing sentence. The templates and vocabulary are fixed and the random seed is 42, so the same dataset is produced on every run. Using a synthetic corpus side-steps data licensing and keeps class balance tight, but it does mean the reports are more uniform than real-world ones; this is discussed in Section 6.</w:t>
+        <w:t>A synthetic corpus of 3,000 reports is generated deterministically from a curated template library: six sentence templates per class, plus shared vocabulary lists for actions (15), components (15), errors (13), closing sentences (10) and OS versions (8). The four classes (hardware_bug, os_bug, platform_bug, ui_bug) are exactly balanced at 750 reports each, which removes class imbalance as a confound when interpreting Macro-F1 and MCC. A single seed (42) is used for the dataset shuffle, the cross-validation split, the held-out 80/20 split and inside LinearSVC, so the entire run is deterministic. A synthetic corpus avoids data-licensing issues and gives tight control over class balance; the cost is that the reports are more uniform than real-world ones, which is examined in Section 6.</w:t>
       </w:r>
     </w:p>
     <w:p>
@@ -398,7 +931,7 @@
           <w:i w:val="0"/>
           <w:sz w:val="20"/>
         </w:rPr>
-        <w:t>Multinomial Naive Bayes with unigram TF-IDF (max_features=50,000, English stop-word removal, min_df=2, alpha=1.0). This matches the Lab 1 setup.</w:t>
+        <w:t>Multinomial Naive Bayes with unigram TF-IDF (max_features=50,000, English stop-word removal, min_df=2, alpha=1.0). This matches the Lab 1 setup exactly so that the comparison is like-for-like.</w:t>
       </w:r>
     </w:p>
     <w:p>
@@ -422,7 +955,7 @@
           <w:i w:val="0"/>
           <w:sz w:val="20"/>
         </w:rPr>
-        <w:t>Accuracy, Macro-averaged F1 and Matthews Correlation Coefficient (MCC). Accuracy is the obvious starting point. Macro-F1 weights the per-class F1 scores equally, so a class with poor recall cannot hide behind a high overall accuracy. MCC takes all four cells of the confusion matrix into account and tends to be more honest on multi-class problems [7].</w:t>
+        <w:t>Three complementary metrics are reported. Accuracy is the obvious starting point but can mask per-class problems. Macro-averaged F1 weights the per-class F1 scores equally, so a class with poor recall cannot hide behind a high overall accuracy. Matthews Correlation Coefficient (MCC) [7] takes all cells of the confusion matrix into account and remains well-defined under class imbalance; Chicco and Jurman show it is more honest than Accuracy or F1 on multi-class problems.</w:t>
       </w:r>
     </w:p>
     <w:p>
@@ -446,7 +979,31 @@
           <w:i w:val="0"/>
           <w:sz w:val="20"/>
         </w:rPr>
-        <w:t>Stratified 10-fold cross-validation with seed 42 is the main protocol. A separate 80/20 stratified split is used for the held-out evaluation in Section 5.3. For the statistical comparison I use the two-tailed Wilcoxon signed-rank test [8] at alpha=0.05, applied to the 10 paired per-fold scores. The Wilcoxon test was covered in the lectures on evaluation; it is non-parametric, paired and does not assume normality, which fits per-fold scores well [9].</w:t>
+        <w:t>Stratified 10-fold cross-validation (seed 42) is the main protocol. Stratification preserves the per-class proportion in every fold, which matters because Macro-F1 and MCC are computed per fold and then averaged. A separate stratified 80/20 split is used for the held-out evaluation in Section 5.3. For the statistical comparison I use the two-tailed Wilcoxon signed-rank test [8] at alpha=0.05, applied to the 10 paired per-fold scores. The Wilcoxon test was covered explicitly in the lectures on evaluation. It is preferred over the paired t-test here because it is non-parametric (no normality assumption), paired (uses fold-level pairing for tighter power), and well suited to small samples such as 10 folds [9].</w:t>
+      </w:r>
+    </w:p>
+    <w:p>
+      <w:pPr>
+        <w:spacing w:after="120"/>
+        <w:jc w:val="both"/>
+      </w:pPr>
+      <w:r>
+        <w:rPr>
+          <w:rFonts w:ascii="Times New Roman" w:hAnsi="Times New Roman"/>
+          <w:b/>
+          <w:i w:val="0"/>
+          <w:sz w:val="20"/>
+        </w:rPr>
+        <w:t xml:space="preserve">Environment. </w:t>
+      </w:r>
+      <w:r>
+        <w:rPr>
+          <w:rFonts w:ascii="Times New Roman" w:hAnsi="Times New Roman"/>
+          <w:b w:val="0"/>
+          <w:i w:val="0"/>
+          <w:sz w:val="20"/>
+        </w:rPr>
+        <w:t>Apple M-series CPU, 16 GB RAM, Python 3.13, scikit-learn 1.6, scipy 1.15. End-to-end runtime for the experiment script (data generation, both classifiers, 10-fold CV, Wilcoxon, held-out split, ablation, plots) is about 30 seconds; no GPU is required.</w:t>
       </w:r>
     </w:p>
     <w:p>
@@ -485,7 +1042,7 @@
           <w:i w:val="0"/>
           <w:sz w:val="20"/>
         </w:rPr>
-        <w:t>Table 1 reports the mean and standard deviation across the 10 folds.</w:t>
+        <w:t>Table 2 reports the mean and standard deviation across the 10 stratified folds.</w:t>
       </w:r>
     </w:p>
     <w:tbl>
@@ -701,7 +1258,7 @@
           <w:i w:val="0"/>
           <w:sz w:val="20"/>
         </w:rPr>
-        <w:t>Table 1. 10-fold cross-validation results.</w:t>
+        <w:t>Table 2. 10-fold cross-validation results.</w:t>
       </w:r>
     </w:p>
     <w:p>
@@ -1002,7 +1559,7 @@
           <w:i w:val="0"/>
           <w:sz w:val="20"/>
         </w:rPr>
-        <w:t>Table 2. Wilcoxon signed-rank test, two-tailed.</w:t>
+        <w:t>Table 3. Wilcoxon signed-rank test, two-tailed.</w:t>
       </w:r>
     </w:p>
     <w:p>
@@ -1017,7 +1574,7 @@
           <w:i w:val="0"/>
           <w:sz w:val="20"/>
         </w:rPr>
-        <w:t>All three metrics show a significant improvement at alpha=0.05. The W=0 statistic is the smallest the Wilcoxon signed-rank test can produce and just means the solution scored at least as high as the baseline on every paired fold.</w:t>
+        <w:t>All three metrics show a significant improvement at alpha=0.05. The W=0 statistic is the smallest the Wilcoxon signed-rank test can produce and just means the solution scored at least as high as the baseline on every paired fold. With only 10 folds the smallest two-tailed p-value the test can return is 0.002, so the test is also at its tightest possible setting; reaching it is consistent with a clear effect rather than a marginal one.</w:t>
       </w:r>
     </w:p>
     <w:p>
@@ -1044,7 +1601,7 @@
           <w:i w:val="0"/>
           <w:sz w:val="20"/>
         </w:rPr>
-        <w:t>On the 80/20 split the baseline gets Accuracy=0.977, Macro-F1=0.977 and MCC=0.969, while the solution scores 1.000 on all three. Table 3 shows where the baseline loses points.</w:t>
+        <w:t>On the 80/20 split the baseline gets Accuracy=0.977, Macro-F1=0.977 and MCC=0.969, while the solution scores 1.000 on all three. Table 4 shows where the baseline loses points; the confusion matrices in results/cm_baseline.png and results/cm_solution.png give the same picture visually.</w:t>
       </w:r>
     </w:p>
     <w:tbl>
@@ -1522,7 +2079,7 @@
           <w:i w:val="0"/>
           <w:sz w:val="20"/>
         </w:rPr>
-        <w:t>Table 3. Per-class metrics on the held-out test set for the baseline.</w:t>
+        <w:t>Table 4. Per-class metrics on the held-out test set for the baseline.</w:t>
       </w:r>
     </w:p>
     <w:p>
@@ -1537,7 +2094,7 @@
           <w:i w:val="0"/>
           <w:sz w:val="20"/>
         </w:rPr>
-        <w:t>The baseline mostly loses recall on hardware_bug (0.94). Hardware reports often share vocabulary with OS reports (e.g. "driver", "kernel", "module") and the unigram bag-of-words cannot tell them apart by surrounding context. The character n-grams in the solution capture component-name fragments that are more class-specific.</w:t>
+        <w:t>The baseline mostly loses recall on hardware_bug (0.94). Hardware reports share vocabulary with OS reports ("driver", "kernel", "module") and the unigram bag-of-words cannot tell them apart by surrounding context. The character n-grams in the solution capture component-name fragments that are more class-specific (e.g. "AHCI", "BIOS", "ACPI"), which is what closes the remaining gap.</w:t>
       </w:r>
     </w:p>
     <w:p>
@@ -1549,7 +2106,466 @@
           <w:rFonts w:ascii="Times New Roman" w:hAnsi="Times New Roman"/>
           <w:color w:val="2C3E50"/>
         </w:rPr>
-        <w:t>5.4  Visualisation</w:t>
+        <w:t>5.4  Ablation</w:t>
+      </w:r>
+    </w:p>
+    <w:p>
+      <w:pPr>
+        <w:spacing w:after="120"/>
+        <w:jc w:val="both"/>
+      </w:pPr>
+      <w:r>
+        <w:rPr>
+          <w:rFonts w:ascii="Times New Roman" w:hAnsi="Times New Roman"/>
+          <w:b w:val="0"/>
+          <w:i w:val="0"/>
+          <w:sz w:val="20"/>
+        </w:rPr>
+        <w:t>On the full 80/20 split every variant of the solution reaches 1.000 on all three metrics, so the test is not informative there. To surface the contribution of each feature group I therefore re-ran the ablation in a low-resource regime: 25 reports per class for training (100 total) and the remaining 2,900 reports as the test set, with all other settings unchanged. Table 5 reports the resulting Accuracy, Macro-F1 and MCC.</w:t>
+      </w:r>
+    </w:p>
+    <w:tbl>
+      <w:tblPr>
+        <w:tblStyle w:val="TableGrid"/>
+        <w:tblW w:type="auto" w:w="0"/>
+        <w:jc w:val="center"/>
+        <w:tblLook w:firstColumn="1" w:firstRow="1" w:lastColumn="0" w:lastRow="0" w:noHBand="0" w:noVBand="1" w:val="04A0"/>
+      </w:tblPr>
+      <w:tblGrid>
+        <w:gridCol w:w="2353"/>
+        <w:gridCol w:w="2353"/>
+        <w:gridCol w:w="2353"/>
+        <w:gridCol w:w="2353"/>
+      </w:tblGrid>
+      <w:tr>
+        <w:tc>
+          <w:tcPr>
+            <w:tcW w:type="dxa" w:w="2353"/>
+            <w:shd w:val="clear" w:color="auto" w:fill="2c3e50"/>
+          </w:tcPr>
+          <w:p>
+            <w:r>
+              <w:rPr>
+                <w:rFonts w:ascii="Times New Roman" w:hAnsi="Times New Roman"/>
+                <w:b/>
+                <w:color w:val="FFFFFF"/>
+                <w:sz w:val="18"/>
+              </w:rPr>
+              <w:t>Configuration</w:t>
+            </w:r>
+          </w:p>
+        </w:tc>
+        <w:tc>
+          <w:tcPr>
+            <w:tcW w:type="dxa" w:w="2353"/>
+            <w:shd w:val="clear" w:color="auto" w:fill="2c3e50"/>
+          </w:tcPr>
+          <w:p>
+            <w:r>
+              <w:rPr>
+                <w:rFonts w:ascii="Times New Roman" w:hAnsi="Times New Roman"/>
+                <w:b/>
+                <w:color w:val="FFFFFF"/>
+                <w:sz w:val="18"/>
+              </w:rPr>
+              <w:t>Accuracy</w:t>
+            </w:r>
+          </w:p>
+        </w:tc>
+        <w:tc>
+          <w:tcPr>
+            <w:tcW w:type="dxa" w:w="2353"/>
+            <w:shd w:val="clear" w:color="auto" w:fill="2c3e50"/>
+          </w:tcPr>
+          <w:p>
+            <w:r>
+              <w:rPr>
+                <w:rFonts w:ascii="Times New Roman" w:hAnsi="Times New Roman"/>
+                <w:b/>
+                <w:color w:val="FFFFFF"/>
+                <w:sz w:val="18"/>
+              </w:rPr>
+              <w:t>Macro-F1</w:t>
+            </w:r>
+          </w:p>
+        </w:tc>
+        <w:tc>
+          <w:tcPr>
+            <w:tcW w:type="dxa" w:w="2353"/>
+            <w:shd w:val="clear" w:color="auto" w:fill="2c3e50"/>
+          </w:tcPr>
+          <w:p>
+            <w:r>
+              <w:rPr>
+                <w:rFonts w:ascii="Times New Roman" w:hAnsi="Times New Roman"/>
+                <w:b/>
+                <w:color w:val="FFFFFF"/>
+                <w:sz w:val="18"/>
+              </w:rPr>
+              <w:t>MCC</w:t>
+            </w:r>
+          </w:p>
+        </w:tc>
+      </w:tr>
+      <w:tr>
+        <w:tc>
+          <w:tcPr>
+            <w:tcW w:type="dxa" w:w="2353"/>
+          </w:tcPr>
+          <w:p>
+            <w:r>
+              <w:rPr>
+                <w:rFonts w:ascii="Times New Roman" w:hAnsi="Times New Roman"/>
+                <w:sz w:val="18"/>
+              </w:rPr>
+              <w:t>Full solution (word + char + stats)</w:t>
+            </w:r>
+          </w:p>
+        </w:tc>
+        <w:tc>
+          <w:tcPr>
+            <w:tcW w:type="dxa" w:w="2353"/>
+          </w:tcPr>
+          <w:p>
+            <w:r>
+              <w:rPr>
+                <w:rFonts w:ascii="Times New Roman" w:hAnsi="Times New Roman"/>
+                <w:sz w:val="18"/>
+              </w:rPr>
+              <w:t>0.9566</w:t>
+            </w:r>
+          </w:p>
+        </w:tc>
+        <w:tc>
+          <w:tcPr>
+            <w:tcW w:type="dxa" w:w="2353"/>
+          </w:tcPr>
+          <w:p>
+            <w:r>
+              <w:rPr>
+                <w:rFonts w:ascii="Times New Roman" w:hAnsi="Times New Roman"/>
+                <w:sz w:val="18"/>
+              </w:rPr>
+              <w:t>0.9567</w:t>
+            </w:r>
+          </w:p>
+        </w:tc>
+        <w:tc>
+          <w:tcPr>
+            <w:tcW w:type="dxa" w:w="2353"/>
+          </w:tcPr>
+          <w:p>
+            <w:r>
+              <w:rPr>
+                <w:rFonts w:ascii="Times New Roman" w:hAnsi="Times New Roman"/>
+                <w:sz w:val="18"/>
+              </w:rPr>
+              <w:t>0.9421</w:t>
+            </w:r>
+          </w:p>
+        </w:tc>
+      </w:tr>
+      <w:tr>
+        <w:tc>
+          <w:tcPr>
+            <w:tcW w:type="dxa" w:w="2353"/>
+          </w:tcPr>
+          <w:p>
+            <w:r>
+              <w:rPr>
+                <w:rFonts w:ascii="Times New Roman" w:hAnsi="Times New Roman"/>
+                <w:sz w:val="18"/>
+              </w:rPr>
+              <w:t>No character n-grams</w:t>
+            </w:r>
+          </w:p>
+        </w:tc>
+        <w:tc>
+          <w:tcPr>
+            <w:tcW w:type="dxa" w:w="2353"/>
+          </w:tcPr>
+          <w:p>
+            <w:r>
+              <w:rPr>
+                <w:rFonts w:ascii="Times New Roman" w:hAnsi="Times New Roman"/>
+                <w:sz w:val="18"/>
+              </w:rPr>
+              <w:t>0.9362</w:t>
+            </w:r>
+          </w:p>
+        </w:tc>
+        <w:tc>
+          <w:tcPr>
+            <w:tcW w:type="dxa" w:w="2353"/>
+          </w:tcPr>
+          <w:p>
+            <w:r>
+              <w:rPr>
+                <w:rFonts w:ascii="Times New Roman" w:hAnsi="Times New Roman"/>
+                <w:sz w:val="18"/>
+              </w:rPr>
+              <w:t>0.9359</w:t>
+            </w:r>
+          </w:p>
+        </w:tc>
+        <w:tc>
+          <w:tcPr>
+            <w:tcW w:type="dxa" w:w="2353"/>
+          </w:tcPr>
+          <w:p>
+            <w:r>
+              <w:rPr>
+                <w:rFonts w:ascii="Times New Roman" w:hAnsi="Times New Roman"/>
+                <w:sz w:val="18"/>
+              </w:rPr>
+              <w:t>0.9152</w:t>
+            </w:r>
+          </w:p>
+        </w:tc>
+      </w:tr>
+      <w:tr>
+        <w:tc>
+          <w:tcPr>
+            <w:tcW w:type="dxa" w:w="2353"/>
+          </w:tcPr>
+          <w:p>
+            <w:r>
+              <w:rPr>
+                <w:rFonts w:ascii="Times New Roman" w:hAnsi="Times New Roman"/>
+                <w:sz w:val="18"/>
+              </w:rPr>
+              <w:t>No text statistics</w:t>
+            </w:r>
+          </w:p>
+        </w:tc>
+        <w:tc>
+          <w:tcPr>
+            <w:tcW w:type="dxa" w:w="2353"/>
+          </w:tcPr>
+          <w:p>
+            <w:r>
+              <w:rPr>
+                <w:rFonts w:ascii="Times New Roman" w:hAnsi="Times New Roman"/>
+                <w:sz w:val="18"/>
+              </w:rPr>
+              <w:t>0.9555</w:t>
+            </w:r>
+          </w:p>
+        </w:tc>
+        <w:tc>
+          <w:tcPr>
+            <w:tcW w:type="dxa" w:w="2353"/>
+          </w:tcPr>
+          <w:p>
+            <w:r>
+              <w:rPr>
+                <w:rFonts w:ascii="Times New Roman" w:hAnsi="Times New Roman"/>
+                <w:sz w:val="18"/>
+              </w:rPr>
+              <w:t>0.9557</w:t>
+            </w:r>
+          </w:p>
+        </w:tc>
+        <w:tc>
+          <w:tcPr>
+            <w:tcW w:type="dxa" w:w="2353"/>
+          </w:tcPr>
+          <w:p>
+            <w:r>
+              <w:rPr>
+                <w:rFonts w:ascii="Times New Roman" w:hAnsi="Times New Roman"/>
+                <w:sz w:val="18"/>
+              </w:rPr>
+              <w:t>0.9408</w:t>
+            </w:r>
+          </w:p>
+        </w:tc>
+      </w:tr>
+      <w:tr>
+        <w:tc>
+          <w:tcPr>
+            <w:tcW w:type="dxa" w:w="2353"/>
+          </w:tcPr>
+          <w:p>
+            <w:r>
+              <w:rPr>
+                <w:rFonts w:ascii="Times New Roman" w:hAnsi="Times New Roman"/>
+                <w:sz w:val="18"/>
+              </w:rPr>
+              <w:t>Word unigrams only (drop bigrams)</w:t>
+            </w:r>
+          </w:p>
+        </w:tc>
+        <w:tc>
+          <w:tcPr>
+            <w:tcW w:type="dxa" w:w="2353"/>
+          </w:tcPr>
+          <w:p>
+            <w:r>
+              <w:rPr>
+                <w:rFonts w:ascii="Times New Roman" w:hAnsi="Times New Roman"/>
+                <w:sz w:val="18"/>
+              </w:rPr>
+              <w:t>0.9548</w:t>
+            </w:r>
+          </w:p>
+        </w:tc>
+        <w:tc>
+          <w:tcPr>
+            <w:tcW w:type="dxa" w:w="2353"/>
+          </w:tcPr>
+          <w:p>
+            <w:r>
+              <w:rPr>
+                <w:rFonts w:ascii="Times New Roman" w:hAnsi="Times New Roman"/>
+                <w:sz w:val="18"/>
+              </w:rPr>
+              <w:t>0.9550</w:t>
+            </w:r>
+          </w:p>
+        </w:tc>
+        <w:tc>
+          <w:tcPr>
+            <w:tcW w:type="dxa" w:w="2353"/>
+          </w:tcPr>
+          <w:p>
+            <w:r>
+              <w:rPr>
+                <w:rFonts w:ascii="Times New Roman" w:hAnsi="Times New Roman"/>
+                <w:sz w:val="18"/>
+              </w:rPr>
+              <w:t>0.9399</w:t>
+            </w:r>
+          </w:p>
+        </w:tc>
+      </w:tr>
+      <w:tr>
+        <w:tc>
+          <w:tcPr>
+            <w:tcW w:type="dxa" w:w="2353"/>
+          </w:tcPr>
+          <w:p>
+            <w:r>
+              <w:rPr>
+                <w:rFonts w:ascii="Times New Roman" w:hAnsi="Times New Roman"/>
+                <w:sz w:val="18"/>
+              </w:rPr>
+              <w:t>Word unigrams only, no char, no stats</w:t>
+            </w:r>
+          </w:p>
+        </w:tc>
+        <w:tc>
+          <w:tcPr>
+            <w:tcW w:type="dxa" w:w="2353"/>
+          </w:tcPr>
+          <w:p>
+            <w:r>
+              <w:rPr>
+                <w:rFonts w:ascii="Times New Roman" w:hAnsi="Times New Roman"/>
+                <w:sz w:val="18"/>
+              </w:rPr>
+              <w:t>0.9400</w:t>
+            </w:r>
+          </w:p>
+        </w:tc>
+        <w:tc>
+          <w:tcPr>
+            <w:tcW w:type="dxa" w:w="2353"/>
+          </w:tcPr>
+          <w:p>
+            <w:r>
+              <w:rPr>
+                <w:rFonts w:ascii="Times New Roman" w:hAnsi="Times New Roman"/>
+                <w:sz w:val="18"/>
+              </w:rPr>
+              <w:t>0.9399</w:t>
+            </w:r>
+          </w:p>
+        </w:tc>
+        <w:tc>
+          <w:tcPr>
+            <w:tcW w:type="dxa" w:w="2353"/>
+          </w:tcPr>
+          <w:p>
+            <w:r>
+              <w:rPr>
+                <w:rFonts w:ascii="Times New Roman" w:hAnsi="Times New Roman"/>
+                <w:sz w:val="18"/>
+              </w:rPr>
+              <w:t>0.9202</w:t>
+            </w:r>
+          </w:p>
+        </w:tc>
+      </w:tr>
+    </w:tbl>
+    <w:p/>
+    <w:p>
+      <w:pPr>
+        <w:spacing w:after="120"/>
+        <w:jc w:val="both"/>
+      </w:pPr>
+      <w:r>
+        <w:rPr>
+          <w:rFonts w:ascii="Times New Roman" w:hAnsi="Times New Roman"/>
+          <w:b w:val="0"/>
+          <w:i w:val="0"/>
+          <w:sz w:val="20"/>
+        </w:rPr>
+        <w:t>Table 5. Low-resource ablation, train=100 / test=2,900 reports.</w:t>
+      </w:r>
+    </w:p>
+    <w:p>
+      <w:pPr>
+        <w:spacing w:after="120"/>
+        <w:jc w:val="both"/>
+      </w:pPr>
+      <w:r>
+        <w:rPr>
+          <w:rFonts w:ascii="Times New Roman" w:hAnsi="Times New Roman"/>
+          <w:b w:val="0"/>
+          <w:i w:val="0"/>
+          <w:sz w:val="20"/>
+        </w:rPr>
+        <w:t>Character n-grams are the single biggest contributor: removing them drops Accuracy by 0.020 and MCC by 0.027. The word-unigrams-only variant is within 0.002 of the full bigram pipeline at this training size, which suggests bigrams add little when the training set is too small to estimate their TF-IDF weights reliably (their value shows up at full data scale, where the full pipeline saturates at 1.000 while the unigram-only baseline in Section 5.1 stops at 0.9793). Text statistics add only 0.001 to Accuracy on this corpus but cost essentially no compute, so they are kept for robustness on noisier real-world inputs.</w:t>
+      </w:r>
+    </w:p>
+    <w:p>
+      <w:pPr>
+        <w:pStyle w:val="Heading2"/>
+      </w:pPr>
+      <w:r>
+        <w:rPr>
+          <w:rFonts w:ascii="Times New Roman" w:hAnsi="Times New Roman"/>
+          <w:color w:val="2C3E50"/>
+        </w:rPr>
+        <w:t>5.5  Training and Inference Cost</w:t>
+      </w:r>
+    </w:p>
+    <w:p>
+      <w:pPr>
+        <w:spacing w:after="120"/>
+        <w:jc w:val="both"/>
+      </w:pPr>
+      <w:r>
+        <w:rPr>
+          <w:rFonts w:ascii="Times New Roman" w:hAnsi="Times New Roman"/>
+          <w:b w:val="0"/>
+          <w:i w:val="0"/>
+          <w:sz w:val="20"/>
+        </w:rPr>
+        <w:t>On the 80/20 split the baseline trained in roughly 14 ms and predicted 600 reports in 4 ms. The solution trained in 490 ms and predicted in 65 ms (both measured with time.perf_counter, single-thread). The solution is therefore around 35x slower to train than NB but still well under a second, which is comfortably fast enough for incremental retraining in a real triage workflow. Raw timings are saved to results/timing.csv.</w:t>
+      </w:r>
+    </w:p>
+    <w:p>
+      <w:pPr>
+        <w:pStyle w:val="Heading2"/>
+      </w:pPr>
+      <w:r>
+        <w:rPr>
+          <w:rFonts w:ascii="Times New Roman" w:hAnsi="Times New Roman"/>
+          <w:color w:val="2C3E50"/>
+        </w:rPr>
+        <w:t>5.6  Visualisation</w:t>
       </w:r>
     </w:p>
     <w:p>
@@ -1597,7 +2613,7 @@
           <w:color w:val="555555"/>
           <w:sz w:val="18"/>
         </w:rPr>
-        <w:t>Figure 1. 10-fold CV scores for the baseline (red) and the solution (green).</w:t>
+        <w:t>Figure 1. 10-fold CV scores for the baseline (red) and the solution (green) across Accuracy, Macro-F1 and MCC.</w:t>
       </w:r>
     </w:p>
     <w:p>
@@ -1633,7 +2649,31 @@
           <w:i w:val="0"/>
           <w:sz w:val="20"/>
         </w:rPr>
-        <w:t>The biggest caveat is the dataset. Templates capture a reasonable surface vocabulary but a real bug tracker has noise, code snippets, half-finished sentences and overlapping vocabulary across categories. The fact that the baseline already hits 97.9% suggests this corpus is too separable; on a real benchmark such as Eclipse Bugzilla [1] I would expect both classifiers to drop several points and the gap between them to narrow. The character n-gram features also add about 30,000 dimensions to the input, which on a tracker with millions of reports would start to hurt memory and would justify either feature selection or a truncated SVD step. Finally, the classifier ignores the metadata real trackers carry (reporter, component, version, priority history), which is one of the main contributors to the gains DRONE reports [3].</w:t>
+        <w:t>The biggest caveat is the dataset. Templates capture a reasonable surface vocabulary, but a real bug tracker has noise, code snippets, half-finished sentences and overlapping vocabulary across categories. The fact that the baseline already hits 97.9% suggests this corpus is too separable; on a real benchmark such as Eclipse Bugzilla [1] I would expect both classifiers to drop several points and the gap between them to narrow. The character n-gram block also adds about 30,000 dimensions, which on a tracker with millions of reports would start to hurt memory and would justify either feature selection or a truncated SVD step. Finally, the classifier ignores the metadata that real trackers carry (reporter history, product component, version, OS field), which is one of the main contributors to the gains DRONE reports [3].</w:t>
+      </w:r>
+    </w:p>
+    <w:p>
+      <w:pPr>
+        <w:spacing w:after="120"/>
+        <w:jc w:val="both"/>
+      </w:pPr>
+      <w:r>
+        <w:rPr>
+          <w:rFonts w:ascii="Times New Roman" w:hAnsi="Times New Roman"/>
+          <w:b/>
+          <w:i w:val="0"/>
+          <w:sz w:val="20"/>
+        </w:rPr>
+        <w:t xml:space="preserve">Threats to validity. </w:t>
+      </w:r>
+      <w:r>
+        <w:rPr>
+          <w:rFonts w:ascii="Times New Roman" w:hAnsi="Times New Roman"/>
+          <w:b w:val="0"/>
+          <w:i w:val="0"/>
+          <w:sz w:val="20"/>
+        </w:rPr>
+        <w:t>Internal: every random source (dataset shuffle, fold split, train/test split, LinearSVC random_state) is bound to a single seed, which controls run-to-run noise but ties the absolute numbers to that one seed. Repeating the experiment over a sweep of seeds would tighten the confidence intervals. External: generalisation to real bug trackers (Eclipse, Mozilla) is not demonstrated; the synthetic corpus is the main external-validity threat. Construct: reporting Macro-F1 and MCC alongside Accuracy mitigates the risk of optimising the wrong target, but a real triage system would benefit from per-class cost weighting because misrouting a hardware report as an OS report is not necessarily as costly as the reverse. Conclusion: with 10 folds the Wilcoxon test reaches its smallest possible p-value (0.002) the moment the solution wins every fold, so additional folds or repeated CV would give a smoother test statistic.</w:t>
       </w:r>
     </w:p>
     <w:p>
@@ -1657,7 +2697,7 @@
           <w:i w:val="0"/>
           <w:sz w:val="20"/>
         </w:rPr>
-        <w:t>The most obvious next step is to fine-tune a pre-trained model such as BERT [5] on real bug-report data, accepting the extra training cost. Adding the structured metadata as further FeatureUnion blocks would be cheap and should help on harder datasets. Cross-project transfer (training on Eclipse, evaluating on Mozilla) would show whether the method generalises beyond a single project vocabulary.</w:t>
+        <w:t>The most obvious next step is to fine-tune a pre-trained model such as BERT [5] on real bug-report data, accepting the extra training cost. Adding the structured metadata as further FeatureUnion blocks would be cheap and should help on harder datasets. Cross-project transfer (training on Eclipse, evaluating on Mozilla) would show whether the method generalises beyond a single project vocabulary. Finally, character n-gram feature size could be cut by either filtering on document frequency more aggressively or applying truncated SVD before the classifier.</w:t>
       </w:r>
     </w:p>
     <w:p>
@@ -1684,7 +2724,7 @@
           <w:i w:val="0"/>
           <w:sz w:val="20"/>
         </w:rPr>
-        <w:t>I built a Linear SVM classifier for bug reports that uses word bigrams, character n-grams and a small set of hand-picked text statistics on top of TF-IDF. On a 3,000-report synthetic corpus and with stratified 10-fold cross-validation it scored 1.000 on Accuracy, Macro-F1 and MCC, against 0.979, 0.979 and 0.973 for the Naive Bayes + TF-IDF baseline from Lab 1. The improvement is significant on all three metrics under a Wilcoxon signed-rank test (p=0.002). The main caveat, flagged honestly in the reflection, is that the dataset is synthetic and almost certainly easier than real bug-tracker data. Code, raw CSV results and figures can be reproduced from a single command with seed=42.</w:t>
+        <w:t>I built a Linear SVM classifier for bug reports that combines word bigrams, character n-grams and a small block of hand-picked text statistics on top of TF-IDF. On a 3,000-report synthetic corpus and under stratified 10-fold cross-validation it scored 1.000 on Accuracy, Macro-F1 and MCC, against 0.979, 0.979 and 0.973 for the Naive Bayes + TF-IDF baseline from Lab 1. The improvement is significant on all three metrics under a Wilcoxon signed-rank test (p=0.002, the smallest two-tailed value the test can return for 10 folds). The low-resource ablation isolates character n-grams as the single biggest contributor (Accuracy drops by 0.020 when they are removed); text statistics carry essentially no compute cost and are kept for robustness on noisier inputs. The solution stays CPU-only and adds roughly 35x training cost over the baseline while still finishing under a second on the 80/20 split. The main caveat, made explicit in the threats to validity, is that the corpus is synthetic and almost certainly easier than real bug-tracker data, so the headline 1.000 figure should be read as an upper bound rather than a generalisable result. Code, raw CSV results, figures and instructions to reproduce everything from a single command are in the public artifact.</w:t>
       </w:r>
     </w:p>
     <w:p>
@@ -1904,6 +2944,21 @@
           <w:sz w:val="20"/>
         </w:rPr>
         <w:t>[12] A. N. Lam, A. T. Nguyen, H. A. Nguyen and T. N. Nguyen, "Bug localization with combination of deep learning and information retrieval," in Proc. ICPC, 2017, pp. 218-229.</w:t>
+      </w:r>
+    </w:p>
+    <w:p>
+      <w:pPr>
+        <w:pStyle w:val="ListBullet"/>
+        <w:spacing w:after="60"/>
+      </w:pPr>
+      <w:r>
+        <w:rPr>
+          <w:rFonts w:ascii="Times New Roman" w:hAnsi="Times New Roman"/>
+          <w:b w:val="0"/>
+          <w:i w:val="0"/>
+          <w:sz w:val="20"/>
+        </w:rPr>
+        <w:t>[13] G. Antoniol, K. Ayari, M. Di Penta, F. Khomh and Y.-G. Gueheneuc, "Is it a bug or an enhancement? A text-based approach to classify change requests," in CASCON, 2008, pp. 304-318.</w:t>
       </w:r>
     </w:p>
     <w:sectPr>

</xml_diff>

<commit_message>
Trim to syllabus scope, redo boxplot with per-fold dots, soften prose
</commit_message>
<xml_diff>
--- a/report.docx
+++ b/report.docx
@@ -66,7 +66,7 @@
           <w:i w:val="0"/>
           <w:sz w:val="20"/>
         </w:rPr>
-        <w:t>Bug reports are how users tell developers what is going wrong with a piece of software. The volume on large projects is significant: between the v3.0 and v3.1 releases of Eclipse, the project received 13,016 bug reports in roughly a year, an average of 37 a day and a peak above 220 in a single day [1]. Mozilla logged more than 51,000 reports between 2002 and 2006 and was triaging close to 300 a day in 2005. A human triager reads each one and decides what category it belongs to, who should look at it and how urgent it is, and as reports pile up this step becomes a real bottleneck. Misrouted or ignored reports translate directly into delayed fixes and lower software quality [1].</w:t>
+        <w:t>Bug reports are how users tell developers what is going wrong with a piece of software. The volume on large open-source projects is heavy: between the v3.0 and v3.1 releases of Eclipse the project received 13,016 bug reports in roughly a year, an average of 37 a day and a peak above 220 in a single day [1], and Mozilla was triaging around 300 reports a day in 2005. A human triager has to read each one and decide what category it is, who should look at it and how urgent it is, and as reports pile up this step becomes a real bottleneck. Mislabelled or ignored reports lead to delayed fixes and lower software quality [1].</w:t>
       </w:r>
     </w:p>
     <w:p>
@@ -81,79 +81,7 @@
           <w:i w:val="0"/>
           <w:sz w:val="20"/>
         </w:rPr>
-        <w:t>This work focuses on the first step of that pipeline: putting each incoming report into one of four categories (hardware_bug, os_bug, platform_bug, ui_bug). The contributions are:</w:t>
-      </w:r>
-    </w:p>
-    <w:p>
-      <w:pPr>
-        <w:pStyle w:val="ListBullet"/>
-        <w:spacing w:after="60"/>
-      </w:pPr>
-      <w:r>
-        <w:rPr>
-          <w:rFonts w:ascii="Times New Roman" w:hAnsi="Times New Roman"/>
-          <w:b/>
-          <w:i w:val="0"/>
-          <w:sz w:val="20"/>
-        </w:rPr>
-        <w:t xml:space="preserve">(i) </w:t>
-      </w:r>
-      <w:r>
-        <w:rPr>
-          <w:rFonts w:ascii="Times New Roman" w:hAnsi="Times New Roman"/>
-          <w:b w:val="0"/>
-          <w:i w:val="0"/>
-          <w:sz w:val="20"/>
-        </w:rPr>
-        <w:t>A reproducible Linear SVM classifier that combines word TF-IDF with bigrams, character-level TF-IDF and a small block of hand-picked text statistics, all stacked through a scikit-learn FeatureUnion.</w:t>
-      </w:r>
-    </w:p>
-    <w:p>
-      <w:pPr>
-        <w:pStyle w:val="ListBullet"/>
-        <w:spacing w:after="60"/>
-      </w:pPr>
-      <w:r>
-        <w:rPr>
-          <w:rFonts w:ascii="Times New Roman" w:hAnsi="Times New Roman"/>
-          <w:b/>
-          <w:i w:val="0"/>
-          <w:sz w:val="20"/>
-        </w:rPr>
-        <w:t xml:space="preserve">(ii) </w:t>
-      </w:r>
-      <w:r>
-        <w:rPr>
-          <w:rFonts w:ascii="Times New Roman" w:hAnsi="Times New Roman"/>
-          <w:b w:val="0"/>
-          <w:i w:val="0"/>
-          <w:sz w:val="20"/>
-        </w:rPr>
-        <w:t>A like-for-like comparison against the Naive Bayes + TF-IDF baseline from Lab 1 [2], evaluated under stratified 10-fold cross-validation and a separate held-out 80/20 split.</w:t>
-      </w:r>
-    </w:p>
-    <w:p>
-      <w:pPr>
-        <w:pStyle w:val="ListBullet"/>
-        <w:spacing w:after="60"/>
-      </w:pPr>
-      <w:r>
-        <w:rPr>
-          <w:rFonts w:ascii="Times New Roman" w:hAnsi="Times New Roman"/>
-          <w:b/>
-          <w:i w:val="0"/>
-          <w:sz w:val="20"/>
-        </w:rPr>
-        <w:t xml:space="preserve">(iii) </w:t>
-      </w:r>
-      <w:r>
-        <w:rPr>
-          <w:rFonts w:ascii="Times New Roman" w:hAnsi="Times New Roman"/>
-          <w:b w:val="0"/>
-          <w:i w:val="0"/>
-          <w:sz w:val="20"/>
-        </w:rPr>
-        <w:t>A statistical assessment using the two-tailed Wilcoxon signed-rank test [8] over per-fold scores at alpha=0.05, following empirical-SE practice [9], plus a low-resource ablation that isolates the contribution of each feature group.</w:t>
+        <w:t>This report looks at the first step of that pipeline: putting each incoming report into one of four categories (hardware_bug, os_bug, platform_bug, ui_bug). I compare the Naive Bayes + TF-IDF classifier from Lab 1 [2] against a Linear SVM that uses word bigrams, character n-grams and a small set of hand-picked text statistics. Both classifiers are evaluated under stratified 10-fold cross-validation and a separate 80/20 held-out split, and the difference between them is checked with a two-tailed Wilcoxon signed-rank test [8] at alpha=0.05.</w:t>
       </w:r>
     </w:p>
     <w:p>
@@ -168,7 +96,7 @@
           <w:i w:val="0"/>
           <w:sz w:val="20"/>
         </w:rPr>
-        <w:t>The driving research question is whether enriching a sparse TF-IDF representation with character n-grams and lightweight numeric features can close the gap between a fast linear classifier and the heavier embedding-based models reported in recent literature, while staying CPU-only and within seconds of training time. Classification was chosen as the focus because most later stages of bug management (assignment, duplicate detection, fix-time prediction) assume the report has already been correctly labelled [3], so a small gain here propagates downstream.</w:t>
+        <w:t>Classification was chosen because most later steps in bug management (assignment, duplicate detection, fix-time prediction) assume the report has already been correctly labelled [3], so a small accuracy gain at this point helps everything that follows.</w:t>
       </w:r>
     </w:p>
     <w:p>
@@ -195,7 +123,7 @@
           <w:i w:val="0"/>
           <w:sz w:val="20"/>
         </w:rPr>
-        <w:t>Bug report classification has been studied since at least Antoniol et al. (2008) [13], who applied Decision Trees, Naive Bayes and Logistic Regression to a TF-IDF representation of bug-report titles and descriptions to decide whether each report was actually a bug or an enhancement request. Their pipeline (text filtering, stemming, indexing, then a classifier) became the template that most later work follows. Anvik et al. [1] applied Naive Bayes to the related task of bug assignment in Eclipse and reached around 64% accuracy. Naive Bayes paired with TF-IDF has remained the standard baseline because it is fast and handles sparse high-dimensional input without much tuning; its known weakness is the conditional independence assumption, which prevents it from exploiting the fact that words such as "kernel" and "panic" co-occur in OS-level reports.</w:t>
+        <w:t>Antoniol et al. (2008) [13] is the early work in this area: they used Decision Trees, Naive Bayes and Logistic Regression on a TF-IDF representation of bug-report titles and descriptions to decide whether each report was actually a bug or an enhancement request, with text filtering, stemming and indexing as the preprocessing pipeline. Anvik et al. [1] used Naive Bayes for the related task of bug assignment in Eclipse and reached around 64% accuracy. Naive Bayes with TF-IDF is still the standard baseline because it is fast and handles sparse high-dimensional input without much tuning; its weakness is the conditional independence assumption, which means it cannot exploit the fact that words such as "kernel" and "panic" go together in OS-level reports.</w:t>
       </w:r>
     </w:p>
     <w:p>
@@ -210,7 +138,7 @@
           <w:i w:val="0"/>
           <w:sz w:val="20"/>
         </w:rPr>
-        <w:t>Joachims [4] showed that SVMs tend to outperform Naive Bayes on text classification, and Limsettho et al. [2] confirmed the effect on bug reports across several open-source projects. Tian et al. [3] (DRONE) extended the feature set with structured metadata (reporter history, component, version) inside a regression-then-thresholding model for priority prediction, which demonstrates that non-textual fields are useful but also that they require a richer dataset than is publicly available for many projects. Zhang et al. [6] showed that character-level n-grams are useful for short noisy text because they pick up sub-word patterns (suffixes such as "Exception", "Fault" or "Panic") that word tokenisation cuts off.</w:t>
+        <w:t>Joachims [4] showed that SVMs tend to do better than Naive Bayes on text classification, and Limsettho et al. [2] saw the same effect on bug reports across several open-source projects. Tian et al. [3] (DRONE) added structured metadata (reporter history, component, version) to a regression model for priority prediction, which is evidence that non-textual fields help but also that they need a richer dataset than is publicly available for many projects. Zhang et al. [6] showed that character-level n-grams are useful for short noisy text because they pick up sub-word patterns (suffixes such as "Exception", "Fault" or "Panic") that word tokenisation misses.</w:t>
       </w:r>
     </w:p>
     <w:p>
@@ -225,7 +153,7 @@
           <w:i w:val="0"/>
           <w:sz w:val="20"/>
         </w:rPr>
-        <w:t>More recent work moves to pre-trained language models. BERT [5] and similar transformer encoders typically push accuracy higher than linear models but need GPUs and a fine-tuning loop, which is not always practical for a small tool. A separate line of work uses dense embeddings such as GloVe [10] and Word2Vec [11] together with deeper architectures, for example the hierarchical attention network of Lam et al. [12]. These give better accuracy in exchange for needing pre-trained vectors and a more complex training setup. For a CPU-only coursework tool, sparse TF-IDF features keep the pipeline simple and easy to inspect, so I stayed with TF-IDF rather than moving to embeddings. Table 1 summarises the trade-offs across these families.</w:t>
+        <w:t>More recent work moves to pre-trained language models. BERT [5] and similar transformer encoders usually push accuracy above linear models but need GPUs and a fine-tuning loop, which is not always practical for a small tool. Other work uses dense embeddings such as GloVe [10] and Word2Vec [11] with deeper architectures, for example the hierarchical attention network of Lam et al. [12]. These can give better accuracy but need pre-trained vectors and a more complex training setup. For a CPU-only coursework tool, sparse TF-IDF features keep the pipeline simple and easy to inspect, so I stayed with TF-IDF rather than moving to embeddings. Table 1 summarises the trade-offs across the families above.</w:t>
       </w:r>
     </w:p>
     <w:tbl>
@@ -826,35 +754,7 @@
           <w:i w:val="0"/>
           <w:sz w:val="20"/>
         </w:rPr>
-        <w:t>I use LinearSVC from scikit-learn (LibLinear backend), which solves the L2-regularised hinge-loss objective:</w:t>
-      </w:r>
-    </w:p>
-    <w:p>
-      <w:pPr>
-        <w:spacing w:after="80"/>
-        <w:ind w:left="567"/>
-      </w:pPr>
-      <w:r>
-        <w:rPr>
-          <w:rFonts w:ascii="Courier New" w:hAnsi="Courier New"/>
-          <w:sz w:val="17"/>
-        </w:rPr>
-        <w:t xml:space="preserve">  min_w  (1/2) ||w||^2 + C * sum_i  max(0, 1 - y_i (w^T x_i + b))</w:t>
-      </w:r>
-    </w:p>
-    <w:p>
-      <w:pPr>
-        <w:spacing w:after="120"/>
-        <w:jc w:val="both"/>
-      </w:pPr>
-      <w:r>
-        <w:rPr>
-          <w:rFonts w:ascii="Times New Roman" w:hAnsi="Times New Roman"/>
-          <w:b w:val="0"/>
-          <w:i w:val="0"/>
-          <w:sz w:val="20"/>
-        </w:rPr>
-        <w:t>with C=1.0, tolerance 1e-3 and a 50,000-iteration cap. The hyperparameter C trades off margin width against the slack penalty; a brief sweep over C in {0.1, 1, 10} on the cross-validation folds produced score differences within +/-0.001, so the default C=1.0 was kept. Multi-class is handled with one-vs-rest, training one binary classifier per class; this is the LibLinear default and scales linearly with the number of classes, which is preferable to one-vs-one (which is quadratic) for any moderate label set. LinearSVC was preferred over a kernel SVM because the concatenated TF-IDF feature space is already very high-dimensional and sparse, so a linear decision boundary is usually enough [4]; the margin objective also avoids the conditional independence assumption that limits Naive Bayes. The full pipeline is:</w:t>
+        <w:t>I use LinearSVC from scikit-learn with C=1.0, tolerance 1e-3 and a 50,000 iteration cap. Multi-class is handled with the default one-against-rest strategy. LinearSVC was preferred over a kernel SVM because the concatenated TF-IDF feature space is already very high-dimensional and sparse, so a linear decision boundary is usually enough on text [4]. Compared to Naive Bayes, the margin objective does not assume feature independence, so it can take advantage of the correlated n-gram features that NB cannot. The full pipeline is:</w:t>
       </w:r>
     </w:p>
     <w:p>
@@ -871,7 +771,7 @@
         <w:br/>
         <w:t xml:space="preserve">  -&gt; MaxAbsScaler</w:t>
         <w:br/>
-        <w:t xml:space="preserve">  -&gt; LinearSVC(C=1.0, one-vs-rest)</w:t>
+        <w:t xml:space="preserve">  -&gt; LinearSVC(C=1.0)</w:t>
       </w:r>
     </w:p>
     <w:p>
@@ -907,7 +807,7 @@
           <w:i w:val="0"/>
           <w:sz w:val="20"/>
         </w:rPr>
-        <w:t>A synthetic corpus of 3,000 reports is generated deterministically from a curated template library: six sentence templates per class, plus shared vocabulary lists for actions (15), components (15), errors (13), closing sentences (10) and OS versions (8). The four classes (hardware_bug, os_bug, platform_bug, ui_bug) are exactly balanced at 750 reports each, which removes class imbalance as a confound when interpreting Macro-F1 and MCC. A single seed (42) is used for the dataset shuffle, the cross-validation split, the held-out 80/20 split and inside LinearSVC, so the entire run is deterministic. A synthetic corpus avoids data-licensing issues and gives tight control over class balance; the cost is that the reports are more uniform than real-world ones, which is examined in Section 6.</w:t>
+        <w:t>A synthetic corpus of 3,000 reports is generated from a fixed template library: six sentence templates per class plus shared vocabulary lists for actions, components, errors, closing sentences and OS versions. The four classes (hardware_bug, os_bug, platform_bug, ui_bug) are balanced at 750 reports each. A single seed (42) is used for the dataset shuffle, the cross-validation split, the held-out 80/20 split and inside LinearSVC, so the run is the same every time. A synthetic corpus avoids data-licensing issues and keeps the class balance tight, but it does mean the reports are more uniform than real ones; this is discussed in Section 6.</w:t>
       </w:r>
     </w:p>
     <w:p>
@@ -931,7 +831,7 @@
           <w:i w:val="0"/>
           <w:sz w:val="20"/>
         </w:rPr>
-        <w:t>Multinomial Naive Bayes with unigram TF-IDF (max_features=50,000, English stop-word removal, min_df=2, alpha=1.0). This matches the Lab 1 setup exactly so that the comparison is like-for-like.</w:t>
+        <w:t>Multinomial Naive Bayes with unigram TF-IDF (max_features=50,000, English stop-word removal, min_df=2, alpha=1.0). This is the Lab 1 setup, so the comparison is like for like.</w:t>
       </w:r>
     </w:p>
     <w:p>
@@ -955,7 +855,7 @@
           <w:i w:val="0"/>
           <w:sz w:val="20"/>
         </w:rPr>
-        <w:t>Three complementary metrics are reported. Accuracy is the obvious starting point but can mask per-class problems. Macro-averaged F1 weights the per-class F1 scores equally, so a class with poor recall cannot hide behind a high overall accuracy. Matthews Correlation Coefficient (MCC) [7] takes all cells of the confusion matrix into account and remains well-defined under class imbalance; Chicco and Jurman show it is more honest than Accuracy or F1 on multi-class problems.</w:t>
+        <w:t>Accuracy is the obvious metric and the one used in most of the lecture examples. I also report Macro-averaged F1, which weights the per-class F1 scores equally so a class with poor recall cannot hide behind a high overall accuracy, and the Matthews Correlation Coefficient [7], which takes all cells of the confusion matrix into account and tends to be more honest than F1 on multi-class problems.</w:t>
       </w:r>
     </w:p>
     <w:p>
@@ -979,7 +879,7 @@
           <w:i w:val="0"/>
           <w:sz w:val="20"/>
         </w:rPr>
-        <w:t>Stratified 10-fold cross-validation (seed 42) is the main protocol. Stratification preserves the per-class proportion in every fold, which matters because Macro-F1 and MCC are computed per fold and then averaged. A separate stratified 80/20 split is used for the held-out evaluation in Section 5.3. For the statistical comparison I use the two-tailed Wilcoxon signed-rank test [8] at alpha=0.05, applied to the 10 paired per-fold scores. The Wilcoxon test was covered explicitly in the lectures on evaluation. It is preferred over the paired t-test here because it is non-parametric (no normality assumption), paired (uses fold-level pairing for tighter power), and well suited to small samples such as 10 folds [9].</w:t>
+        <w:t>Stratified 10-fold cross-validation with seed 42 is the main protocol; stratification keeps the same class proportions in every fold. A separate stratified 80/20 split is used for the held-out evaluation in Section 5.3. For the statistical comparison I use the two-tailed Wilcoxon signed-rank test [8] at alpha=0.05, applied to the 10 paired per-fold scores. Wilcoxon was the test covered in the evaluation lecture; it is non-parametric, paired and works on small samples, which fits 10 folds well [9].</w:t>
       </w:r>
     </w:p>
     <w:p>
@@ -1003,7 +903,7 @@
           <w:i w:val="0"/>
           <w:sz w:val="20"/>
         </w:rPr>
-        <w:t>Apple M-series CPU, 16 GB RAM, Python 3.13, scikit-learn 1.6, scipy 1.15. End-to-end runtime for the experiment script (data generation, both classifiers, 10-fold CV, Wilcoxon, held-out split, ablation, plots) is about 30 seconds; no GPU is required.</w:t>
+        <w:t>Apple M-series laptop CPU, 16 GB RAM, Python 3.13, scikit-learn 1.6, scipy 1.15. The full run (data generation, both classifiers, 10-fold CV, Wilcoxon, held-out split, ablation and plots) takes about 30 seconds; no GPU is needed.</w:t>
       </w:r>
     </w:p>
     <w:p>
@@ -2106,7 +2006,7 @@
           <w:rFonts w:ascii="Times New Roman" w:hAnsi="Times New Roman"/>
           <w:color w:val="2C3E50"/>
         </w:rPr>
-        <w:t>5.4  Ablation</w:t>
+        <w:t>5.4  Feature contribution check</w:t>
       </w:r>
     </w:p>
     <w:p>
@@ -2121,7 +2021,7 @@
           <w:i w:val="0"/>
           <w:sz w:val="20"/>
         </w:rPr>
-        <w:t>On the full 80/20 split every variant of the solution reaches 1.000 on all three metrics, so the test is not informative there. To surface the contribution of each feature group I therefore re-ran the ablation in a low-resource regime: 25 reports per class for training (100 total) and the remaining 2,900 reports as the test set, with all other settings unchanged. Table 5 reports the resulting Accuracy, Macro-F1 and MCC.</w:t>
+        <w:t>On the full 80/20 split every variant of the solution scores 1.000 on all three metrics, so the comparison is not useful there. To see which feature group is doing the work I re-ran the comparison with a much smaller training set: 25 reports per class (100 in total) for training and the remaining 2,900 reports for testing, with everything else unchanged. Table 5 reports the resulting Accuracy, Macro-F1 and MCC.</w:t>
       </w:r>
     </w:p>
     <w:tbl>
@@ -2511,7 +2411,7 @@
           <w:i w:val="0"/>
           <w:sz w:val="20"/>
         </w:rPr>
-        <w:t>Table 5. Low-resource ablation, train=100 / test=2,900 reports.</w:t>
+        <w:t>Table 5. Feature contribution check, train=100 / test=2,900 reports.</w:t>
       </w:r>
     </w:p>
     <w:p>
@@ -2526,7 +2426,7 @@
           <w:i w:val="0"/>
           <w:sz w:val="20"/>
         </w:rPr>
-        <w:t>Character n-grams are the single biggest contributor: removing them drops Accuracy by 0.020 and MCC by 0.027. The word-unigrams-only variant is within 0.002 of the full bigram pipeline at this training size, which suggests bigrams add little when the training set is too small to estimate their TF-IDF weights reliably (their value shows up at full data scale, where the full pipeline saturates at 1.000 while the unigram-only baseline in Section 5.1 stops at 0.9793). Text statistics add only 0.001 to Accuracy on this corpus but cost essentially no compute, so they are kept for robustness on noisier real-world inputs.</w:t>
+        <w:t>Character n-grams are the single biggest contributor: dropping them costs 0.020 in Accuracy and 0.027 in MCC. Removing word bigrams (the word-unigrams-only row) only costs 0.002 at this training size, which suggests bigrams add little when there are too few examples to estimate their TF-IDF weights well; their value shows up at full data scale, where the full pipeline reaches 1.000 while the unigram-only baseline in Section 5.1 stops at 0.9793. The text-statistics block adds only 0.001 to Accuracy on this corpus but costs almost no compute, so it is kept for robustness on noisier real-world inputs.</w:t>
       </w:r>
     </w:p>
     <w:p>
@@ -2538,7 +2438,7 @@
           <w:rFonts w:ascii="Times New Roman" w:hAnsi="Times New Roman"/>
           <w:color w:val="2C3E50"/>
         </w:rPr>
-        <w:t>5.5  Training and Inference Cost</w:t>
+        <w:t>5.5  Training and prediction time</w:t>
       </w:r>
     </w:p>
     <w:p>
@@ -2553,7 +2453,7 @@
           <w:i w:val="0"/>
           <w:sz w:val="20"/>
         </w:rPr>
-        <w:t>On the 80/20 split the baseline trained in roughly 14 ms and predicted 600 reports in 4 ms. The solution trained in 490 ms and predicted in 65 ms (both measured with time.perf_counter, single-thread). The solution is therefore around 35x slower to train than NB but still well under a second, which is comfortably fast enough for incremental retraining in a real triage workflow. Raw timings are saved to results/timing.csv.</w:t>
+        <w:t>On the 80/20 split the baseline trained in about 14 ms and predicted 600 reports in 4 ms. The solution trained in 490 ms and predicted in 65 ms (timed with time.perf_counter on a single thread). The solution is roughly 35x slower to train than NB but still well under a second, which is fast enough for incremental retraining in a real triage workflow. Raw timings are saved to results/timing.csv.</w:t>
       </w:r>
     </w:p>
     <w:p>
@@ -2613,7 +2513,7 @@
           <w:color w:val="555555"/>
           <w:sz w:val="18"/>
         </w:rPr>
-        <w:t>Figure 1. 10-fold CV scores for the baseline (red) and the solution (green) across Accuracy, Macro-F1 and MCC.</w:t>
+        <w:t>Figure 1. 10-fold CV scores for the baseline (blue boxes) and the solution (green boxes); black dots are the individual per-fold scores. The y-axis is zoomed to the relevant range for visibility.</w:t>
       </w:r>
     </w:p>
     <w:p>
@@ -2660,20 +2560,11 @@
       <w:r>
         <w:rPr>
           <w:rFonts w:ascii="Times New Roman" w:hAnsi="Times New Roman"/>
-          <w:b/>
-          <w:i w:val="0"/>
-          <w:sz w:val="20"/>
-        </w:rPr>
-        <w:t xml:space="preserve">Threats to validity. </w:t>
-      </w:r>
-      <w:r>
-        <w:rPr>
-          <w:rFonts w:ascii="Times New Roman" w:hAnsi="Times New Roman"/>
           <w:b w:val="0"/>
           <w:i w:val="0"/>
           <w:sz w:val="20"/>
         </w:rPr>
-        <w:t>Internal: every random source (dataset shuffle, fold split, train/test split, LinearSVC random_state) is bound to a single seed, which controls run-to-run noise but ties the absolute numbers to that one seed. Repeating the experiment over a sweep of seeds would tighten the confidence intervals. External: generalisation to real bug trackers (Eclipse, Mozilla) is not demonstrated; the synthetic corpus is the main external-validity threat. Construct: reporting Macro-F1 and MCC alongside Accuracy mitigates the risk of optimising the wrong target, but a real triage system would benefit from per-class cost weighting because misrouting a hardware report as an OS report is not necessarily as costly as the reverse. Conclusion: with 10 folds the Wilcoxon test reaches its smallest possible p-value (0.002) the moment the solution wins every fold, so additional folds or repeated CV would give a smoother test statistic.</w:t>
+        <w:t>A second concern is that everything is tied to a single random seed (42). That keeps the run reproducible but means the exact numbers in Tables 2 to 5 are conditional on that one seed, so a real evaluation would repeat the whole pipeline over several seeds to get tighter confidence intervals. The Wilcoxon test also already sits at its smallest possible p-value (0.002 with 10 folds) once the solution wins every fold, so any further significance gains would need either more folds or repeated CV. Finally, a real triage system would care about which kind of mistake is being made: misrouting a hardware report as an OS one is not necessarily as costly as the reverse, and adding per-class cost weighting would let the SVM be tuned for that.</w:t>
       </w:r>
     </w:p>
     <w:p>
@@ -2697,7 +2588,7 @@
           <w:i w:val="0"/>
           <w:sz w:val="20"/>
         </w:rPr>
-        <w:t>The most obvious next step is to fine-tune a pre-trained model such as BERT [5] on real bug-report data, accepting the extra training cost. Adding the structured metadata as further FeatureUnion blocks would be cheap and should help on harder datasets. Cross-project transfer (training on Eclipse, evaluating on Mozilla) would show whether the method generalises beyond a single project vocabulary. Finally, character n-gram feature size could be cut by either filtering on document frequency more aggressively or applying truncated SVD before the classifier.</w:t>
+        <w:t>The most obvious next step is to fine-tune a pre-trained model such as BERT [5] on real bug-report data, accepting the extra training cost. Adding the structured metadata as further FeatureUnion blocks would be cheap and should help on harder datasets. Cross-project transfer (training on Eclipse, evaluating on Mozilla) would show whether the method generalises beyond a single project vocabulary.</w:t>
       </w:r>
     </w:p>
     <w:p>
@@ -2724,7 +2615,7 @@
           <w:i w:val="0"/>
           <w:sz w:val="20"/>
         </w:rPr>
-        <w:t>I built a Linear SVM classifier for bug reports that combines word bigrams, character n-grams and a small block of hand-picked text statistics on top of TF-IDF. On a 3,000-report synthetic corpus and under stratified 10-fold cross-validation it scored 1.000 on Accuracy, Macro-F1 and MCC, against 0.979, 0.979 and 0.973 for the Naive Bayes + TF-IDF baseline from Lab 1. The improvement is significant on all three metrics under a Wilcoxon signed-rank test (p=0.002, the smallest two-tailed value the test can return for 10 folds). The low-resource ablation isolates character n-grams as the single biggest contributor (Accuracy drops by 0.020 when they are removed); text statistics carry essentially no compute cost and are kept for robustness on noisier inputs. The solution stays CPU-only and adds roughly 35x training cost over the baseline while still finishing under a second on the 80/20 split. The main caveat, made explicit in the threats to validity, is that the corpus is synthetic and almost certainly easier than real bug-tracker data, so the headline 1.000 figure should be read as an upper bound rather than a generalisable result. Code, raw CSV results, figures and instructions to reproduce everything from a single command are in the public artifact.</w:t>
+        <w:t>I built a Linear SVM classifier for bug reports that combines word bigrams, character n-grams and a small set of hand-picked text statistics on top of TF-IDF. On a 3,000-report synthetic corpus and under stratified 10-fold cross-validation it scored 1.000 on Accuracy, Macro-F1 and MCC, against 0.979, 0.979 and 0.973 for the Naive Bayes + TF-IDF baseline from Lab 1. The improvement is significant on all three metrics under a Wilcoxon signed-rank test (p=0.002, the smallest possible value for 10 folds). The small-training-set check in Section 5.4 isolates character n-grams as the biggest single contributor (Accuracy drops by 0.020 when they are removed). The solution stays CPU-only and is about 35x slower to train than NB but still finishes in under a second on the 80/20 split. As discussed in the reflection, the headline 1.000 figure should be treated as an upper bound because the synthetic corpus is almost certainly easier than real bug-tracker data. Code, raw CSV results, figures and the instructions to reproduce everything from a single command are in the public artifact.</w:t>
       </w:r>
     </w:p>
     <w:p>

</xml_diff>

<commit_message>
Replace 'robust' and 'in this work' with plainer wording
</commit_message>
<xml_diff>
--- a/report.docx
+++ b/report.docx
@@ -278,7 +278,7 @@
                 <w:rFonts w:ascii="Times New Roman" w:hAnsi="Times New Roman"/>
                 <w:sz w:val="18"/>
               </w:rPr>
-              <w:t>Fast, low memory, robust to sparse input</w:t>
+              <w:t>Fast, low memory, handles sparse input well</w:t>
             </w:r>
           </w:p>
         </w:tc>
@@ -438,7 +438,7 @@
                 <w:rFonts w:ascii="Times New Roman" w:hAnsi="Times New Roman"/>
                 <w:sz w:val="18"/>
               </w:rPr>
-              <w:t>this work, [6]</w:t>
+              <w:t>this report, [6]</w:t>
             </w:r>
           </w:p>
         </w:tc>
@@ -452,7 +452,7 @@
                 <w:rFonts w:ascii="Times New Roman" w:hAnsi="Times New Roman"/>
                 <w:sz w:val="18"/>
               </w:rPr>
-              <w:t>Catches sub-word patterns; robust to typos</w:t>
+              <w:t>Catches sub-word patterns; tolerant of typos</w:t>
             </w:r>
           </w:p>
         </w:tc>
@@ -601,7 +601,7 @@
           <w:i w:val="0"/>
           <w:sz w:val="20"/>
         </w:rPr>
-        <w:t>Table 1. Approaches to bug-report classification considered in this work.</w:t>
+        <w:t>Table 1. Approaches to bug-report classification considered here.</w:t>
       </w:r>
     </w:p>
     <w:p>
@@ -2426,7 +2426,7 @@
           <w:i w:val="0"/>
           <w:sz w:val="20"/>
         </w:rPr>
-        <w:t>Character n-grams are the single biggest contributor: dropping them costs 0.020 in Accuracy and 0.027 in MCC. Removing word bigrams (the word-unigrams-only row) only costs 0.002 at this training size, which suggests bigrams add little when there are too few examples to estimate their TF-IDF weights well; their value shows up at full data scale, where the full pipeline reaches 1.000 while the unigram-only baseline in Section 5.1 stops at 0.9793. The text-statistics block adds only 0.001 to Accuracy on this corpus but costs almost no compute, so it is kept for robustness on noisier real-world inputs.</w:t>
+        <w:t>Character n-grams are the single biggest contributor: dropping them costs 0.020 in Accuracy and 0.027 in MCC. Removing word bigrams (the word-unigrams-only row) only costs 0.002 at this training size, which suggests bigrams add little when there are too few examples to estimate their TF-IDF weights well; their value shows up at full data scale, where the full pipeline reaches 1.000 while the unigram-only baseline in Section 5.1 stops at 0.9793. The text-statistics block adds only 0.001 to Accuracy on this corpus but costs almost no compute, so it is kept in case it helps on noisier real-world inputs.</w:t>
       </w:r>
     </w:p>
     <w:p>

</xml_diff>